<commit_message>
Tydeliggjør mal: BILDE: eksplisitt like under TITTEL, før INGRESS/HOVEDTEKST
Feltrekkefølgen betydde ingenting for parseren (kun tilstedeværelse av
labels + posisjon på bilder teller), men var forvirrende for mennesker
å lese - hovedbildet lå tidligere midt inni HOVEDTEKST uten noen egen
markering. Ny rekkefølge: TITTEL -> BILDE: (bilde limes inn her) ->
ALT-TEKST BILDE -> FOTO -> INGRESS -> HOVEDTEKST. Verifisert mot
parseArticlesFromStructured() - fortsatt 2 rene saker, 0 advarsler.

Co-Authored-By: Claude Sonnet 5 <noreply@anthropic.com>
</commit_message>
<xml_diff>
--- a/docs/Mal-opplasting-av-saker.docx
+++ b/docs/Mal-opplasting-av-saker.docx
@@ -90,7 +90,7 @@
         <w:spacing w:after="80"/>
       </w:pPr>
       <w:r>
-        <w:t xml:space="preserve">Bilder limes rett inn i dokumentet (anbefalt, enklest) - det første bildet i en sak blir automatisk hovedbilde. Legger du inn flere bilder, settes de inn i brødteksten akkurat der du plasserte dem.</w:t>
+        <w:t xml:space="preserve">Legg BILDE:-linjen rett under TITTEL, og lim hovedbildet inn på linjen rett under den (anbefalt, enklest). Det er det FØRSTE bildet i saken som blir hovedbilde - resten av rekkefølgen (INGRESS/HOVEDTEKST) spiller ingen rolle for hva som blir hovedbilde.</w:t>
       </w:r>
     </w:p>
     <w:p>
@@ -103,7 +103,7 @@
         <w:spacing w:after="80"/>
       </w:pPr>
       <w:r>
-        <w:t xml:space="preserve">Fungerer best for moderate dokumentstørrelser (grovt sagt under ~5 MB bilder totalt). For store batcher med mange/store bilder: last dem opp som egne filer i stedet, og referer til dem med BILDE: filnavn.jpg.</w:t>
+        <w:t xml:space="preserve">Vil du sette inn flere bilder senere i saken (midt i brødteksten): lim dem bare inn der i teksten - de dukker opp akkurat der når saken opprettes.</w:t>
       </w:r>
     </w:p>
     <w:p>
@@ -116,7 +116,7 @@
         <w:spacing w:after="80"/>
       </w:pPr>
       <w:r>
-        <w:t xml:space="preserve">Kategori, stikkord og byline (fritekst) settes i selve appen, ikke i dokumentet - enten per sak eller samlet for alle saker med «Sett samme for alle saker».</w:t>
+        <w:t xml:space="preserve">Fungerer best for moderate dokumentstørrelser (grovt sagt under ~5 MB bilder totalt). For store batcher med mange/store bilder: last bildene opp som egne filer i stedet, og skriv filnavnet rett etter BILDE: (f.eks. BILDE: bilde-01.jpg) i stedet for å lime inn bildet.</w:t>
       </w:r>
     </w:p>
     <w:p>
@@ -129,133 +129,7 @@
         <w:spacing w:after="80"/>
       </w:pPr>
       <w:r>
-        <w:t xml:space="preserve">Bildetekst kan skrives i appen, eller genereres automatisk ut fra bildet med «Analyser med AI».</w:t>
-      </w:r>
-    </w:p>
-    <w:p>
-      <w:pPr>
-        <w:pStyle w:val="Heading1"/>
-        <w:spacing w:after="160" w:before="320"/>
-      </w:pPr>
-      <w:r>
-        <w:t xml:space="preserve">Feltene som skal brukes</w:t>
-      </w:r>
-    </w:p>
-    <w:p>
-      <w:pPr>
-        <w:spacing w:after="100"/>
-      </w:pPr>
-      <w:r>
-        <w:rPr>
-          <w:rFonts w:ascii="Consolas" w:cs="Consolas" w:eastAsia="Consolas" w:hAnsi="Consolas"/>
-          <w:b/>
-          <w:bCs/>
-          <w:sz w:val="20"/>
-          <w:szCs w:val="20"/>
-        </w:rPr>
-        <w:t xml:space="preserve">TITTEL – </w:t>
-      </w:r>
-      <w:r>
-        <w:t xml:space="preserve">Sakens tittel. Obligatorisk.</w:t>
-      </w:r>
-    </w:p>
-    <w:p>
-      <w:pPr>
-        <w:spacing w:after="100"/>
-      </w:pPr>
-      <w:r>
-        <w:rPr>
-          <w:rFonts w:ascii="Consolas" w:cs="Consolas" w:eastAsia="Consolas" w:hAnsi="Consolas"/>
-          <w:b/>
-          <w:bCs/>
-          <w:sz w:val="20"/>
-          <w:szCs w:val="20"/>
-        </w:rPr>
-        <w:t xml:space="preserve">INGRESS – </w:t>
-      </w:r>
-      <w:r>
-        <w:t xml:space="preserve">Kort ingress, 1–3 setninger.</w:t>
-      </w:r>
-    </w:p>
-    <w:p>
-      <w:pPr>
-        <w:spacing w:after="100"/>
-      </w:pPr>
-      <w:r>
-        <w:rPr>
-          <w:rFonts w:ascii="Consolas" w:cs="Consolas" w:eastAsia="Consolas" w:hAnsi="Consolas"/>
-          <w:b/>
-          <w:bCs/>
-          <w:sz w:val="20"/>
-          <w:szCs w:val="20"/>
-        </w:rPr>
-        <w:t xml:space="preserve">HOVEDTEKST – </w:t>
-      </w:r>
-      <w:r>
-        <w:t xml:space="preserve">Selve brødteksten. Kan ha flere avsnitt – la det stå en tom linje mellom avsnittene.</w:t>
-      </w:r>
-    </w:p>
-    <w:p>
-      <w:pPr>
-        <w:spacing w:after="100"/>
-      </w:pPr>
-      <w:r>
-        <w:rPr>
-          <w:rFonts w:ascii="Consolas" w:cs="Consolas" w:eastAsia="Consolas" w:hAnsi="Consolas"/>
-          <w:b/>
-          <w:bCs/>
-          <w:sz w:val="20"/>
-          <w:szCs w:val="20"/>
-        </w:rPr>
-        <w:t xml:space="preserve">(bilde limt inn) – </w:t>
-      </w:r>
-      <w:r>
-        <w:t xml:space="preserve">Første bilde i saken = hovedbilde. Eventuelle flere bilder settes inn i brødteksten der de er plassert.</w:t>
-      </w:r>
-    </w:p>
-    <w:p>
-      <w:pPr>
-        <w:spacing w:after="100"/>
-      </w:pPr>
-      <w:r>
-        <w:rPr>
-          <w:rFonts w:ascii="Consolas" w:cs="Consolas" w:eastAsia="Consolas" w:hAnsi="Consolas"/>
-          <w:b/>
-          <w:bCs/>
-          <w:sz w:val="20"/>
-          <w:szCs w:val="20"/>
-        </w:rPr>
-        <w:t xml:space="preserve">ALT-TEKST BILDE – </w:t>
-      </w:r>
-      <w:r>
-        <w:t xml:space="preserve">Kort beskrivelse av hovedbildet, for synshemmede og SEO.</w:t>
-      </w:r>
-    </w:p>
-    <w:p>
-      <w:pPr>
-        <w:spacing w:after="100"/>
-      </w:pPr>
-      <w:r>
-        <w:rPr>
-          <w:rFonts w:ascii="Consolas" w:cs="Consolas" w:eastAsia="Consolas" w:hAnsi="Consolas"/>
-          <w:b/>
-          <w:bCs/>
-          <w:sz w:val="20"/>
-          <w:szCs w:val="20"/>
-        </w:rPr>
-        <w:t xml:space="preserve">FOTO – </w:t>
-      </w:r>
-      <w:r>
-        <w:t xml:space="preserve">Valgfritt. Fotokreditering, f.eks. et navn. Kan også settes/endres i appen.</w:t>
-      </w:r>
-    </w:p>
-    <w:p>
-      <w:pPr>
-        <w:pStyle w:val="Heading1"/>
-        <w:spacing w:after="160" w:before="320"/>
-      </w:pPr>
-      <w:r>
-        <w:t xml:space="preserve">Sjekkliste før du laster opp</w:t>
+        <w:t xml:space="preserve">Kategori, stikkord og byline (fritekst) settes i selve appen, ikke i dokumentet - enten per sak eller samlet for alle saker med «Sett samme for alle saker».</w:t>
       </w:r>
     </w:p>
     <w:p>
@@ -268,7 +142,133 @@
         <w:spacing w:after="80"/>
       </w:pPr>
       <w:r>
-        <w:t xml:space="preserve">Har alle saker TITTEL, INGRESS, HOVEDTEKST og minst ett bilde? (FOTO er valgfritt.)</w:t>
+        <w:t xml:space="preserve">Bildetekst kan skrives i appen, eller genereres automatisk ut fra bildet med «Analyser med AI».</w:t>
+      </w:r>
+    </w:p>
+    <w:p>
+      <w:pPr>
+        <w:pStyle w:val="Heading1"/>
+        <w:spacing w:after="160" w:before="320"/>
+      </w:pPr>
+      <w:r>
+        <w:t xml:space="preserve">Feltene som skal brukes</w:t>
+      </w:r>
+    </w:p>
+    <w:p>
+      <w:pPr>
+        <w:spacing w:after="100"/>
+      </w:pPr>
+      <w:r>
+        <w:rPr>
+          <w:rFonts w:ascii="Consolas" w:cs="Consolas" w:eastAsia="Consolas" w:hAnsi="Consolas"/>
+          <w:b/>
+          <w:bCs/>
+          <w:sz w:val="20"/>
+          <w:szCs w:val="20"/>
+        </w:rPr>
+        <w:t xml:space="preserve">TITTEL – </w:t>
+      </w:r>
+      <w:r>
+        <w:t xml:space="preserve">Sakens tittel. Obligatorisk.</w:t>
+      </w:r>
+    </w:p>
+    <w:p>
+      <w:pPr>
+        <w:spacing w:after="100"/>
+      </w:pPr>
+      <w:r>
+        <w:rPr>
+          <w:rFonts w:ascii="Consolas" w:cs="Consolas" w:eastAsia="Consolas" w:hAnsi="Consolas"/>
+          <w:b/>
+          <w:bCs/>
+          <w:sz w:val="20"/>
+          <w:szCs w:val="20"/>
+        </w:rPr>
+        <w:t xml:space="preserve">BILDE – </w:t>
+      </w:r>
+      <w:r>
+        <w:t xml:space="preserve">Lim inn hovedbildet rett under denne linjen (eller skriv et filnavn hvis du bruker separate bildefiler).</w:t>
+      </w:r>
+    </w:p>
+    <w:p>
+      <w:pPr>
+        <w:spacing w:after="100"/>
+      </w:pPr>
+      <w:r>
+        <w:rPr>
+          <w:rFonts w:ascii="Consolas" w:cs="Consolas" w:eastAsia="Consolas" w:hAnsi="Consolas"/>
+          <w:b/>
+          <w:bCs/>
+          <w:sz w:val="20"/>
+          <w:szCs w:val="20"/>
+        </w:rPr>
+        <w:t xml:space="preserve">ALT-TEKST BILDE – </w:t>
+      </w:r>
+      <w:r>
+        <w:t xml:space="preserve">Kort beskrivelse av hovedbildet, for synshemmede og SEO.</w:t>
+      </w:r>
+    </w:p>
+    <w:p>
+      <w:pPr>
+        <w:spacing w:after="100"/>
+      </w:pPr>
+      <w:r>
+        <w:rPr>
+          <w:rFonts w:ascii="Consolas" w:cs="Consolas" w:eastAsia="Consolas" w:hAnsi="Consolas"/>
+          <w:b/>
+          <w:bCs/>
+          <w:sz w:val="20"/>
+          <w:szCs w:val="20"/>
+        </w:rPr>
+        <w:t xml:space="preserve">FOTO – </w:t>
+      </w:r>
+      <w:r>
+        <w:t xml:space="preserve">Valgfritt. Fotokreditering, f.eks. et navn. Kan også settes/endres i appen.</w:t>
+      </w:r>
+    </w:p>
+    <w:p>
+      <w:pPr>
+        <w:spacing w:after="100"/>
+      </w:pPr>
+      <w:r>
+        <w:rPr>
+          <w:rFonts w:ascii="Consolas" w:cs="Consolas" w:eastAsia="Consolas" w:hAnsi="Consolas"/>
+          <w:b/>
+          <w:bCs/>
+          <w:sz w:val="20"/>
+          <w:szCs w:val="20"/>
+        </w:rPr>
+        <w:t xml:space="preserve">INGRESS – </w:t>
+      </w:r>
+      <w:r>
+        <w:t xml:space="preserve">Kort ingress, 1–3 setninger.</w:t>
+      </w:r>
+    </w:p>
+    <w:p>
+      <w:pPr>
+        <w:spacing w:after="100"/>
+      </w:pPr>
+      <w:r>
+        <w:rPr>
+          <w:rFonts w:ascii="Consolas" w:cs="Consolas" w:eastAsia="Consolas" w:hAnsi="Consolas"/>
+          <w:b/>
+          <w:bCs/>
+          <w:sz w:val="20"/>
+          <w:szCs w:val="20"/>
+        </w:rPr>
+        <w:t xml:space="preserve">HOVEDTEKST – </w:t>
+      </w:r>
+      <w:r>
+        <w:t xml:space="preserve">Selve brødteksten. Kan ha flere avsnitt – la det stå en tom linje mellom avsnittene. Flere bilder kan limes inn her, hvor som helst.</w:t>
+      </w:r>
+    </w:p>
+    <w:p>
+      <w:pPr>
+        <w:pStyle w:val="Heading1"/>
+        <w:spacing w:after="160" w:before="320"/>
+      </w:pPr>
+      <w:r>
+        <w:t xml:space="preserve">Sjekkliste før du laster opp</w:t>
       </w:r>
     </w:p>
     <w:p>
@@ -281,7 +281,7 @@
         <w:spacing w:after="80"/>
       </w:pPr>
       <w:r>
-        <w:t xml:space="preserve">Er sakene skilt med en egen linje med kun === mellom hver sak?</w:t>
+        <w:t xml:space="preserve">Har alle saker TITTEL, INGRESS, HOVEDTEKST og minst ett bilde? (FOTO er valgfritt.)</w:t>
       </w:r>
     </w:p>
     <w:p>
@@ -294,6 +294,19 @@
         <w:spacing w:after="80"/>
       </w:pPr>
       <w:r>
+        <w:t xml:space="preserve">Er sakene skilt med en egen linje med kun === mellom hver sak?</w:t>
+      </w:r>
+    </w:p>
+    <w:p>
+      <w:pPr>
+        <w:pStyle w:val="ListParagraph"/>
+        <w:numPr>
+          <w:ilvl w:val="0"/>
+          <w:numId w:val="2"/>
+        </w:numPr>
+        <w:spacing w:after="80"/>
+      </w:pPr>
+      <w:r>
         <w:t xml:space="preserve">Er dokumentet (inkl. bilder) under ca. 5 MB totalt? Hvis ikke: bruk separate bildefiler i stedet.</w:t>
       </w:r>
     </w:p>
@@ -363,58 +376,7 @@
           <w:sz w:val="19"/>
           <w:szCs w:val="19"/>
         </w:rPr>
-        <w:t xml:space="preserve">INGRESS: EASA har vedtatt nye regler for elektriske vertikaltstartende fly, med virkning fra januar.</w:t>
-      </w:r>
-    </w:p>
-    <w:p>
-      <w:pPr>
-        <w:shd w:fill="F2F2F0" w:val="clear"/>
-        <w:spacing w:after="0"/>
-        <w:ind w:left="200" w:right="200"/>
-      </w:pPr>
-      <w:r>
-        <w:rPr>
-          <w:rFonts w:ascii="Consolas" w:cs="Consolas" w:eastAsia="Consolas" w:hAnsi="Consolas"/>
-          <w:b w:val="false"/>
-          <w:bCs w:val="false"/>
-          <w:sz w:val="19"/>
-          <w:szCs w:val="19"/>
-        </w:rPr>
-        <w:t xml:space="preserve">HOVEDTEKST:</w:t>
-      </w:r>
-    </w:p>
-    <w:p>
-      <w:pPr>
-        <w:shd w:fill="F2F2F0" w:val="clear"/>
-        <w:spacing w:after="0"/>
-        <w:ind w:left="200" w:right="200"/>
-      </w:pPr>
-      <w:r>
-        <w:rPr>
-          <w:rFonts w:ascii="Consolas" w:cs="Consolas" w:eastAsia="Consolas" w:hAnsi="Consolas"/>
-          <w:b w:val="false"/>
-          <w:bCs w:val="false"/>
-          <w:sz w:val="19"/>
-          <w:szCs w:val="19"/>
-        </w:rPr>
-        <w:t xml:space="preserve">Det europeiske flysikkerhetsbyrået EASA har vedtatt et nytt regelverk som skal gjelde</w:t>
-      </w:r>
-    </w:p>
-    <w:p>
-      <w:pPr>
-        <w:shd w:fill="F2F2F0" w:val="clear"/>
-        <w:spacing w:after="0"/>
-        <w:ind w:left="200" w:right="200"/>
-      </w:pPr>
-      <w:r>
-        <w:rPr>
-          <w:rFonts w:ascii="Consolas" w:cs="Consolas" w:eastAsia="Consolas" w:hAnsi="Consolas"/>
-          <w:b w:val="false"/>
-          <w:bCs w:val="false"/>
-          <w:sz w:val="19"/>
-          <w:szCs w:val="19"/>
-        </w:rPr>
-        <w:t xml:space="preserve">for E-VTOL-fartøy i hele EU/EØS-området.</w:t>
+        <w:t xml:space="preserve">BILDE:</w:t>
       </w:r>
     </w:p>
     <w:p>
@@ -478,6 +440,108 @@
           <w:sz w:val="19"/>
           <w:szCs w:val="19"/>
         </w:rPr>
+        <w:t xml:space="preserve">ALT-TEKST BILDE: Elektrisk vertikaltstartende fly i luften over en by</w:t>
+      </w:r>
+    </w:p>
+    <w:p>
+      <w:pPr>
+        <w:shd w:fill="F2F2F0" w:val="clear"/>
+        <w:spacing w:after="0"/>
+        <w:ind w:left="200" w:right="200"/>
+      </w:pPr>
+      <w:r>
+        <w:rPr>
+          <w:rFonts w:ascii="Consolas" w:cs="Consolas" w:eastAsia="Consolas" w:hAnsi="Consolas"/>
+          <w:b w:val="false"/>
+          <w:bCs w:val="false"/>
+          <w:sz w:val="19"/>
+          <w:szCs w:val="19"/>
+        </w:rPr>
+        <w:t xml:space="preserve">FOTO: EASA</w:t>
+      </w:r>
+    </w:p>
+    <w:p>
+      <w:pPr>
+        <w:shd w:fill="F2F2F0" w:val="clear"/>
+        <w:spacing w:after="0"/>
+        <w:ind w:left="200" w:right="200"/>
+      </w:pPr>
+      <w:r>
+        <w:rPr>
+          <w:rFonts w:ascii="Consolas" w:cs="Consolas" w:eastAsia="Consolas" w:hAnsi="Consolas"/>
+          <w:b w:val="false"/>
+          <w:bCs w:val="false"/>
+          <w:sz w:val="19"/>
+          <w:szCs w:val="19"/>
+        </w:rPr>
+        <w:t xml:space="preserve">INGRESS: EASA har vedtatt nye regler for elektriske vertikaltstartende fly, med virkning fra januar.</w:t>
+      </w:r>
+    </w:p>
+    <w:p>
+      <w:pPr>
+        <w:shd w:fill="F2F2F0" w:val="clear"/>
+        <w:spacing w:after="0"/>
+        <w:ind w:left="200" w:right="200"/>
+      </w:pPr>
+      <w:r>
+        <w:rPr>
+          <w:rFonts w:ascii="Consolas" w:cs="Consolas" w:eastAsia="Consolas" w:hAnsi="Consolas"/>
+          <w:b w:val="false"/>
+          <w:bCs w:val="false"/>
+          <w:sz w:val="19"/>
+          <w:szCs w:val="19"/>
+        </w:rPr>
+        <w:t xml:space="preserve">HOVEDTEKST:</w:t>
+      </w:r>
+    </w:p>
+    <w:p>
+      <w:pPr>
+        <w:shd w:fill="F2F2F0" w:val="clear"/>
+        <w:spacing w:after="0"/>
+        <w:ind w:left="200" w:right="200"/>
+      </w:pPr>
+      <w:r>
+        <w:rPr>
+          <w:rFonts w:ascii="Consolas" w:cs="Consolas" w:eastAsia="Consolas" w:hAnsi="Consolas"/>
+          <w:b w:val="false"/>
+          <w:bCs w:val="false"/>
+          <w:sz w:val="19"/>
+          <w:szCs w:val="19"/>
+        </w:rPr>
+        <w:t xml:space="preserve">Det europeiske flysikkerhetsbyrået EASA har vedtatt et nytt regelverk som skal gjelde</w:t>
+      </w:r>
+    </w:p>
+    <w:p>
+      <w:pPr>
+        <w:shd w:fill="F2F2F0" w:val="clear"/>
+        <w:spacing w:after="0"/>
+        <w:ind w:left="200" w:right="200"/>
+      </w:pPr>
+      <w:r>
+        <w:rPr>
+          <w:rFonts w:ascii="Consolas" w:cs="Consolas" w:eastAsia="Consolas" w:hAnsi="Consolas"/>
+          <w:b w:val="false"/>
+          <w:bCs w:val="false"/>
+          <w:sz w:val="19"/>
+          <w:szCs w:val="19"/>
+        </w:rPr>
+        <w:t xml:space="preserve">for E-VTOL-fartøy i hele EU/EØS-området.</w:t>
+      </w:r>
+    </w:p>
+    <w:p>
+      <w:pPr>
+        <w:shd w:fill="F2F2F0" w:val="clear"/>
+        <w:spacing w:after="0"/>
+        <w:ind w:left="200" w:right="200"/>
+      </w:pPr>
+      <w:r>
+        <w:rPr>
+          <w:rFonts w:ascii="Consolas" w:cs="Consolas" w:eastAsia="Consolas" w:hAnsi="Consolas"/>
+          <w:b w:val="false"/>
+          <w:bCs w:val="false"/>
+          <w:sz w:val="19"/>
+          <w:szCs w:val="19"/>
+        </w:rPr>
         <w:t xml:space="preserve">Regelverket trer i kraft fra januar neste år, og norske aktører må forholde seg til</w:t>
       </w:r>
     </w:p>
@@ -496,40 +560,6 @@
           <w:szCs w:val="19"/>
         </w:rPr>
         <w:t xml:space="preserve">de samme kravene som resten av Europa.</w:t>
-      </w:r>
-    </w:p>
-    <w:p>
-      <w:pPr>
-        <w:shd w:fill="F2F2F0" w:val="clear"/>
-        <w:spacing w:after="0"/>
-        <w:ind w:left="200" w:right="200"/>
-      </w:pPr>
-      <w:r>
-        <w:rPr>
-          <w:rFonts w:ascii="Consolas" w:cs="Consolas" w:eastAsia="Consolas" w:hAnsi="Consolas"/>
-          <w:b w:val="false"/>
-          <w:bCs w:val="false"/>
-          <w:sz w:val="19"/>
-          <w:szCs w:val="19"/>
-        </w:rPr>
-        <w:t xml:space="preserve">ALT-TEKST BILDE: Elektrisk vertikaltstartende fly i luften over en by</w:t>
-      </w:r>
-    </w:p>
-    <w:p>
-      <w:pPr>
-        <w:shd w:fill="F2F2F0" w:val="clear"/>
-        <w:spacing w:after="0"/>
-        <w:ind w:left="200" w:right="200"/>
-      </w:pPr>
-      <w:r>
-        <w:rPr>
-          <w:rFonts w:ascii="Consolas" w:cs="Consolas" w:eastAsia="Consolas" w:hAnsi="Consolas"/>
-          <w:b w:val="false"/>
-          <w:bCs w:val="false"/>
-          <w:sz w:val="19"/>
-          <w:szCs w:val="19"/>
-        </w:rPr>
-        <w:t xml:space="preserve">FOTO: EASA</w:t>
       </w:r>
     </w:p>
     <w:p>
@@ -581,58 +611,7 @@
           <w:sz w:val="19"/>
           <w:szCs w:val="19"/>
         </w:rPr>
-        <w:t xml:space="preserve">INGRESS: Bransjeforeningen mener Luftfartstilsynet bruker for lang tid på søknader om spesiell tillatelse.</w:t>
-      </w:r>
-    </w:p>
-    <w:p>
-      <w:pPr>
-        <w:shd w:fill="F2F2F0" w:val="clear"/>
-        <w:spacing w:after="0"/>
-        <w:ind w:left="200" w:right="200"/>
-      </w:pPr>
-      <w:r>
-        <w:rPr>
-          <w:rFonts w:ascii="Consolas" w:cs="Consolas" w:eastAsia="Consolas" w:hAnsi="Consolas"/>
-          <w:b w:val="false"/>
-          <w:bCs w:val="false"/>
-          <w:sz w:val="19"/>
-          <w:szCs w:val="19"/>
-        </w:rPr>
-        <w:t xml:space="preserve">HOVEDTEKST:</w:t>
-      </w:r>
-    </w:p>
-    <w:p>
-      <w:pPr>
-        <w:shd w:fill="F2F2F0" w:val="clear"/>
-        <w:spacing w:after="0"/>
-        <w:ind w:left="200" w:right="200"/>
-      </w:pPr>
-      <w:r>
-        <w:rPr>
-          <w:rFonts w:ascii="Consolas" w:cs="Consolas" w:eastAsia="Consolas" w:hAnsi="Consolas"/>
-          <w:b w:val="false"/>
-          <w:bCs w:val="false"/>
-          <w:sz w:val="19"/>
-          <w:szCs w:val="19"/>
-        </w:rPr>
-        <w:t xml:space="preserve">I et brev til Luftfartstilsynet ber flere droneoperatører om kortere saksbehandlingstid</w:t>
-      </w:r>
-    </w:p>
-    <w:p>
-      <w:pPr>
-        <w:shd w:fill="F2F2F0" w:val="clear"/>
-        <w:spacing w:after="0"/>
-        <w:ind w:left="200" w:right="200"/>
-      </w:pPr>
-      <w:r>
-        <w:rPr>
-          <w:rFonts w:ascii="Consolas" w:cs="Consolas" w:eastAsia="Consolas" w:hAnsi="Consolas"/>
-          <w:b w:val="false"/>
-          <w:bCs w:val="false"/>
-          <w:sz w:val="19"/>
-          <w:szCs w:val="19"/>
-        </w:rPr>
-        <w:t xml:space="preserve">for søknader om spesifikk kategori-tillatelser.</w:t>
+        <w:t xml:space="preserve">BILDE:</w:t>
       </w:r>
     </w:p>
     <w:p>
@@ -696,6 +675,91 @@
           <w:sz w:val="19"/>
           <w:szCs w:val="19"/>
         </w:rPr>
+        <w:t xml:space="preserve">ALT-TEKST BILDE: Drone-operatør med fjernkontroll ved en landingsplass</w:t>
+      </w:r>
+    </w:p>
+    <w:p>
+      <w:pPr>
+        <w:shd w:fill="F2F2F0" w:val="clear"/>
+        <w:spacing w:after="0"/>
+        <w:ind w:left="200" w:right="200"/>
+      </w:pPr>
+      <w:r>
+        <w:rPr>
+          <w:rFonts w:ascii="Consolas" w:cs="Consolas" w:eastAsia="Consolas" w:hAnsi="Consolas"/>
+          <w:b w:val="false"/>
+          <w:bCs w:val="false"/>
+          <w:sz w:val="19"/>
+          <w:szCs w:val="19"/>
+        </w:rPr>
+        <w:t xml:space="preserve">INGRESS: Bransjeforeningen mener Luftfartstilsynet bruker for lang tid på søknader om spesiell tillatelse.</w:t>
+      </w:r>
+    </w:p>
+    <w:p>
+      <w:pPr>
+        <w:shd w:fill="F2F2F0" w:val="clear"/>
+        <w:spacing w:after="0"/>
+        <w:ind w:left="200" w:right="200"/>
+      </w:pPr>
+      <w:r>
+        <w:rPr>
+          <w:rFonts w:ascii="Consolas" w:cs="Consolas" w:eastAsia="Consolas" w:hAnsi="Consolas"/>
+          <w:b w:val="false"/>
+          <w:bCs w:val="false"/>
+          <w:sz w:val="19"/>
+          <w:szCs w:val="19"/>
+        </w:rPr>
+        <w:t xml:space="preserve">HOVEDTEKST:</w:t>
+      </w:r>
+    </w:p>
+    <w:p>
+      <w:pPr>
+        <w:shd w:fill="F2F2F0" w:val="clear"/>
+        <w:spacing w:after="0"/>
+        <w:ind w:left="200" w:right="200"/>
+      </w:pPr>
+      <w:r>
+        <w:rPr>
+          <w:rFonts w:ascii="Consolas" w:cs="Consolas" w:eastAsia="Consolas" w:hAnsi="Consolas"/>
+          <w:b w:val="false"/>
+          <w:bCs w:val="false"/>
+          <w:sz w:val="19"/>
+          <w:szCs w:val="19"/>
+        </w:rPr>
+        <w:t xml:space="preserve">I et brev til Luftfartstilsynet ber flere droneoperatører om kortere saksbehandlingstid</w:t>
+      </w:r>
+    </w:p>
+    <w:p>
+      <w:pPr>
+        <w:shd w:fill="F2F2F0" w:val="clear"/>
+        <w:spacing w:after="0"/>
+        <w:ind w:left="200" w:right="200"/>
+      </w:pPr>
+      <w:r>
+        <w:rPr>
+          <w:rFonts w:ascii="Consolas" w:cs="Consolas" w:eastAsia="Consolas" w:hAnsi="Consolas"/>
+          <w:b w:val="false"/>
+          <w:bCs w:val="false"/>
+          <w:sz w:val="19"/>
+          <w:szCs w:val="19"/>
+        </w:rPr>
+        <w:t xml:space="preserve">for søknader om spesifikk kategori-tillatelser.</w:t>
+      </w:r>
+    </w:p>
+    <w:p>
+      <w:pPr>
+        <w:shd w:fill="F2F2F0" w:val="clear"/>
+        <w:spacing w:after="0"/>
+        <w:ind w:left="200" w:right="200"/>
+      </w:pPr>
+      <w:r>
+        <w:rPr>
+          <w:rFonts w:ascii="Consolas" w:cs="Consolas" w:eastAsia="Consolas" w:hAnsi="Consolas"/>
+          <w:b w:val="false"/>
+          <w:bCs w:val="false"/>
+          <w:sz w:val="19"/>
+          <w:szCs w:val="19"/>
+        </w:rPr>
         <w:t xml:space="preserve">Bransjeforeningen mener ventetiden har blitt en flaskehals for flere kommersielle</w:t>
       </w:r>
     </w:p>
@@ -797,23 +861,6 @@
         <w:t xml:space="preserve">hvor som helst i brødteksten - ikke bare øverst.</w:t>
       </w:r>
     </w:p>
-    <w:p>
-      <w:pPr>
-        <w:shd w:fill="F2F2F0" w:val="clear"/>
-        <w:spacing w:after="0"/>
-        <w:ind w:left="200" w:right="200"/>
-      </w:pPr>
-      <w:r>
-        <w:rPr>
-          <w:rFonts w:ascii="Consolas" w:cs="Consolas" w:eastAsia="Consolas" w:hAnsi="Consolas"/>
-          <w:b w:val="false"/>
-          <w:bCs w:val="false"/>
-          <w:sz w:val="19"/>
-          <w:szCs w:val="19"/>
-        </w:rPr>
-        <w:t xml:space="preserve">ALT-TEKST BILDE: Drone-operatør med fjernkontroll ved en landingsplass</w:t>
-      </w:r>
-    </w:p>
     <w:sectPr>
       <w:pgSz w:w="12240" w:h="15840" w:orient="portrait"/>
       <w:pgMar w:top="1080" w:right="1080" w:bottom="1080" w:left="1080" w:header="708" w:footer="708" w:gutter="0"/>

</xml_diff>